<commit_message>
fix: correction index.js v5
</commit_message>
<xml_diff>
--- a/server/plantillas/plantilla.docx
+++ b/server/plantillas/plantilla.docx
@@ -20,7 +20,12 @@
           </w:tcPr>
           <w:p>
             <w:r>
-              <w:t>{#filas}</w:t>
+              <w:t>{{#filas}}</w:t>
+            </w:r>
+          </w:p>
+          <w:p>
+            <w:r>
+              <w:t>{{#tiene1}}</w:t>
             </w:r>
           </w:p>
           <w:p>
@@ -28,14 +33,25 @@
               <w:t>{%foto1}</w:t>
             </w:r>
           </w:p>
+          <w:p/>
           <w:p>
             <w:r>
-              <w:t>Imagen {{num1}}: {{descripcion1}}</w:t>
+              <w:t>Imagen {{num1}}:</w:t>
+            </w:r>
+          </w:p>
+          <w:p>
+            <w:r>
+              <w:t>{{description1}}</w:t>
             </w:r>
           </w:p>
           <w:p>
             <w:r>
               <w:t>Fecha: {{fecha1}}</w:t>
+            </w:r>
+          </w:p>
+          <w:p>
+            <w:r>
+              <w:t>{{/tiene1}}</w:t>
             </w:r>
           </w:p>
         </w:tc>
@@ -45,7 +61,7 @@
           </w:tcPr>
           <w:p>
             <w:r>
-              <w:t>{#tiene2}</w:t>
+              <w:t>{{#tiene2}}</w:t>
             </w:r>
           </w:p>
           <w:p>
@@ -53,9 +69,15 @@
               <w:t>{%foto2}</w:t>
             </w:r>
           </w:p>
+          <w:p/>
           <w:p>
             <w:r>
-              <w:t>Imagen {{num2}}: {{descripcion2}}</w:t>
+              <w:t>Imagen {{num2}}:</w:t>
+            </w:r>
+          </w:p>
+          <w:p>
+            <w:r>
+              <w:t>{{description2}}</w:t>
             </w:r>
           </w:p>
           <w:p>
@@ -65,12 +87,12 @@
           </w:p>
           <w:p>
             <w:r>
-              <w:t>{/tiene2}</w:t>
+              <w:t>{{/tiene2}}</w:t>
             </w:r>
           </w:p>
           <w:p>
             <w:r>
-              <w:t>{/filas}</w:t>
+              <w:t>{{/filas}}</w:t>
             </w:r>
           </w:p>
         </w:tc>

</xml_diff>

<commit_message>
Corrige plantilla Word v2
</commit_message>
<xml_diff>
--- a/server/plantillas/plantilla.docx
+++ b/server/plantillas/plantilla.docx
@@ -3,126 +3,66 @@
 <w:document xmlns:wpc="http://schemas.microsoft.com/office/word/2010/wordprocessingCanvas" xmlns:cx="http://schemas.microsoft.com/office/drawing/2014/chartex" xmlns:cx1="http://schemas.microsoft.com/office/drawing/2015/9/8/chartex" xmlns:cx2="http://schemas.microsoft.com/office/drawing/2015/10/21/chartex" xmlns:cx3="http://schemas.microsoft.com/office/drawing/2016/5/9/chartex" xmlns:cx4="http://schemas.microsoft.com/office/drawing/2016/5/10/chartex" xmlns:cx5="http://schemas.microsoft.com/office/drawing/2016/5/11/chartex" xmlns:cx6="http://schemas.microsoft.com/office/drawing/2016/5/12/chartex" xmlns:cx7="http://schemas.microsoft.com/office/drawing/2016/5/13/chartex" xmlns:cx8="http://schemas.microsoft.com/office/drawing/2016/5/14/chartex" xmlns:mc="http://schemas.openxmlformats.org/markup-compatibility/2006" xmlns:aink="http://schemas.microsoft.com/office/drawing/2016/ink" xmlns:am3d="http://schemas.microsoft.com/office/drawing/2017/model3d" xmlns:o="urn:schemas-microsoft-com:office:office" xmlns:oel="http://schemas.microsoft.com/office/2019/extlst" xmlns:r="http://schemas.openxmlformats.org/officeDocument/2006/relationships" xmlns:m="http://schemas.openxmlformats.org/officeDocument/2006/math" xmlns:v="urn:schemas-microsoft-com:vml" xmlns:wp14="http://schemas.microsoft.com/office/word/2010/wordprocessingDrawing" xmlns:wp="http://schemas.openxmlformats.org/drawingml/2006/wordprocessingDrawing" xmlns:w10="urn:schemas-microsoft-com:office:word" xmlns:w="http://schemas.openxmlformats.org/wordprocessingml/2006/main" xmlns:w14="http://schemas.microsoft.com/office/word/2010/wordml" xmlns:w15="http://schemas.microsoft.com/office/word/2012/wordml" xmlns:w16cex="http://schemas.microsoft.com/office/word/2018/wordml/cex" xmlns:w16cid="http://schemas.microsoft.com/office/word/2016/wordml/cid" xmlns:w16="http://schemas.microsoft.com/office/word/2018/wordml" xmlns:w16sdtdh="http://schemas.microsoft.com/office/word/2020/wordml/sdtdatahash" xmlns:w16se="http://schemas.microsoft.com/office/word/2015/wordml/symex" xmlns:wpg="http://schemas.microsoft.com/office/word/2010/wordprocessingGroup" xmlns:wpi="http://schemas.microsoft.com/office/word/2010/wordprocessingInk" xmlns:wne="http://schemas.microsoft.com/office/word/2006/wordml" xmlns:wps="http://schemas.microsoft.com/office/word/2010/wordprocessingShape" mc:Ignorable="w14 w15 w16se w16cid w16 w16cex w16sdtdh wp14">
   <w:body>
     <w:p>
-      <w:pPr>
-        <w:rPr>
-          <w:lang w:val="es-MX"/>
-        </w:rPr>
-      </w:pPr>
       <w:r>
-        <w:rPr>
-          <w:lang w:val="es-MX"/>
-        </w:rPr>
         <w:t>{#filas}</w:t>
       </w:r>
     </w:p>
     <w:p>
-      <w:pPr>
-        <w:rPr>
-          <w:lang w:val="es-MX"/>
-        </w:rPr>
-      </w:pPr>
       <w:r>
-        <w:rPr>
-          <w:lang w:val="es-MX"/>
-        </w:rPr>
         <w:t>{%foto1}</w:t>
-      </w:r>
-      <w:r>
-        <w:rPr>
-          <w:lang w:val="es-MX"/>
-        </w:rPr>
-        <w:tab/>
-        <w:t>{#tiene</w:t>
-      </w:r>
-      <w:proofErr w:type="gramStart"/>
-      <w:r>
-        <w:rPr>
-          <w:lang w:val="es-MX"/>
-        </w:rPr>
-        <w:t>2}{</w:t>
-      </w:r>
-      <w:proofErr w:type="gramEnd"/>
-      <w:r>
-        <w:rPr>
-          <w:lang w:val="es-MX"/>
-        </w:rPr>
-        <w:t>%foto2}{/tiene2}</w:t>
-      </w:r>
-    </w:p>
-    <w:p>
-      <w:pPr>
-        <w:rPr>
-          <w:lang w:val="es-MX"/>
-        </w:rPr>
-      </w:pPr>
-      <w:r>
-        <w:rPr>
-          <w:lang w:val="es-MX"/>
-        </w:rPr>
-        <w:t>Imagen {num1}: {descripcion1}</w:t>
-      </w:r>
-      <w:r>
-        <w:rPr>
-          <w:lang w:val="es-MX"/>
-        </w:rPr>
-        <w:tab/>
-        <w:t>{#tiene</w:t>
-      </w:r>
-      <w:proofErr w:type="gramStart"/>
-      <w:r>
-        <w:rPr>
-          <w:lang w:val="es-MX"/>
-        </w:rPr>
-        <w:t>2}Imagen</w:t>
-      </w:r>
-      <w:proofErr w:type="gramEnd"/>
-      <w:r>
-        <w:rPr>
-          <w:lang w:val="es-MX"/>
-        </w:rPr>
-        <w:t xml:space="preserve"> {num2}: {descripcion2}{/tiene2}</w:t>
-      </w:r>
-    </w:p>
-    <w:p>
-      <w:pPr>
-        <w:rPr>
-          <w:lang w:val="es-MX"/>
-        </w:rPr>
-      </w:pPr>
-      <w:r>
-        <w:rPr>
-          <w:lang w:val="es-MX"/>
-        </w:rPr>
-        <w:t>Fecha: {fecha1}</w:t>
-      </w:r>
-      <w:r>
-        <w:rPr>
-          <w:lang w:val="es-MX"/>
-        </w:rPr>
-        <w:tab/>
-        <w:t>{#tiene</w:t>
-      </w:r>
-      <w:proofErr w:type="gramStart"/>
-      <w:r>
-        <w:rPr>
-          <w:lang w:val="es-MX"/>
-        </w:rPr>
-        <w:t>2}Fecha</w:t>
-      </w:r>
-      <w:proofErr w:type="gramEnd"/>
-      <w:r>
-        <w:rPr>
-          <w:lang w:val="es-MX"/>
-        </w:rPr>
-        <w:t>: {fecha2}{/tiene2}</w:t>
       </w:r>
     </w:p>
     <w:p>
       <w:r>
-        <w:rPr>
-          <w:lang w:val="es-MX"/>
-        </w:rPr>
-        <w:t>{/filas}</w:t>
+        <w:t>Imagen {num1}: {descripcion1}</w:t>
+      </w:r>
+    </w:p>
+    <w:p>
+      <w:r>
+        <w:t>Fecha: {fecha1}</w:t>
+      </w:r>
+    </w:p>
+    <w:p/>
+    <w:p>
+      <w:r>
+        <w:t>{#tiene2}</w:t>
+      </w:r>
+    </w:p>
+    <w:p>
+      <w:r>
+        <w:t>{%foto2}</w:t>
+      </w:r>
+    </w:p>
+    <w:p>
+      <w:r>
+        <w:t>Imagen {num2}: {descripcion2}</w:t>
+      </w:r>
+    </w:p>
+    <w:p>
+      <w:r>
+        <w:t>Fecha: {fecha2}</w:t>
+      </w:r>
+    </w:p>
+    <w:p>
+      <w:r>
+        <w:t>{/tiene2}</w:t>
+      </w:r>
+    </w:p>
+    <w:p/>
+    <w:p>
+      <w:r>
+        <w:t>{#saltoPagina}</w:t>
+      </w:r>
+    </w:p>
+    <w:p>
+      <w:r>
+        <w:br w:type="page"/>
+      </w:r>
+    </w:p>
+    <w:p>
+      <w:r>
+        <w:lastRenderedPageBreak/>
+        <w:t>{/saltoPagina}{/filas}</w:t>
       </w:r>
     </w:p>
     <w:sectPr>
@@ -1069,7 +1009,6 @@
   <w:style w:type="character" w:default="1" w:styleId="Fuentedeprrafopredeter">
     <w:name w:val="Default Paragraph Font"/>
     <w:uiPriority w:val="1"/>
-    <w:semiHidden/>
     <w:unhideWhenUsed/>
   </w:style>
   <w:style w:type="table" w:default="1" w:styleId="Tablanormal">

</xml_diff>

<commit_message>
Version 2 - Generacion de reportes PDF y Word
</commit_message>
<xml_diff>
--- a/server/plantillas/plantilla.docx
+++ b/server/plantillas/plantilla.docx
@@ -62,7 +62,15 @@
     <w:p>
       <w:r>
         <w:lastRenderedPageBreak/>
-        <w:t>{/saltoPagina}{/filas}</w:t>
+        <w:t>{/</w:t>
+      </w:r>
+      <w:proofErr w:type="gramStart"/>
+      <w:r>
+        <w:t>saltoPagina}{</w:t>
+      </w:r>
+      <w:proofErr w:type="gramEnd"/>
+      <w:r>
+        <w:t>/filas}</w:t>
       </w:r>
     </w:p>
     <w:sectPr>
@@ -340,27 +348,6 @@
           </wp14:sizeRelV>
         </wp:anchor>
       </w:drawing>
-    </w:r>
-    <w:r>
-      <w:rPr>
-        <w:rFonts w:asciiTheme="majorHAnsi" w:hAnsiTheme="majorHAnsi" w:cstheme="majorHAnsi"/>
-        <w:b/>
-        <w:bCs/>
-        <w:noProof/>
-        <w:color w:val="CC1422"/>
-        <w:u w:val="single"/>
-      </w:rPr>
-      <w:t>TÍTULO</w:t>
-    </w:r>
-    <w:r>
-      <w:rPr>
-        <w:rFonts w:asciiTheme="majorHAnsi" w:hAnsiTheme="majorHAnsi" w:cstheme="majorHAnsi"/>
-        <w:b/>
-        <w:bCs/>
-        <w:color w:val="CC1422"/>
-        <w:u w:val="single"/>
-      </w:rPr>
-      <w:t xml:space="preserve"> ENCABEZADO</w:t>
     </w:r>
   </w:p>
 </w:hdr>
@@ -1009,6 +996,7 @@
   <w:style w:type="character" w:default="1" w:styleId="Fuentedeprrafopredeter">
     <w:name w:val="Default Paragraph Font"/>
     <w:uiPriority w:val="1"/>
+    <w:semiHidden/>
     <w:unhideWhenUsed/>
   </w:style>
   <w:style w:type="table" w:default="1" w:styleId="Tablanormal">

</xml_diff>